<commit_message>
Paula Fernandes: revisão da Parte 5 e roteiro completo
Co-Authored-By: Claude Opus 5.5 <noreply@anthropic.com>
Claude-Session: https://claude.ai/code/session_01MJjUEEZrxQDEUifKK2vj9g
</commit_message>
<xml_diff>
--- a/roteiros/paula-fernandes/Paula_Parte5.docx
+++ b/roteiros/paula-fernandes/Paula_Parte5.docx
@@ -31,7 +31,7 @@
         <w:rPr>
           <w:color w:val="000000"/>
         </w:rPr>
-        <w:t>A arena estava lotada. Arquibancadas cheias até o alto, cheiro de terra batida, peões encostados na cerca esperando a hora de montar.</w:t>
+        <w:t>Era a noite de abertura do rodeio. A arena de terra batida, as arquibancadas cheias e os peões esperando a hora de montar.</w:t>
       </w:r>
     </w:p>
     <w:p>
@@ -64,14 +64,6 @@
           <w:color w:val="000000"/>
         </w:rPr>
         <w:t>Naquela noite, quem ia cantar era Paula Fernandes.</w:t>
-      </w:r>
-    </w:p>
-    <w:p>
-      <w:r>
-        <w:rPr>
-          <w:color w:val="000000"/>
-        </w:rPr>
-        <w:t>As luzes se voltaram para a entrada da arena.</w:t>
       </w:r>
     </w:p>
     <w:p>
@@ -295,7 +287,7 @@
         <w:rPr>
           <w:color w:val="000000"/>
         </w:rPr>
-        <w:t>Durante quase vinte anos, o Brasil inteiro cantou com Paula Fernandes sem saber que aquela voz quase não existiu. Que, por trás do vestido longo e do sorriso tímido, havia uma jovem que escolheu uma janela. E uma mãe que não deixou.</w:t>
+        <w:t>Durante quase duas décadas, o Brasil inteiro cantou com Paula Fernandes sem saber que aquela voz quase não existiu. Que, por trás do vestido longo e do sorriso tímido, havia uma jovem que escolheu uma janela. E uma mãe que não deixou.</w:t>
       </w:r>
     </w:p>
     <w:p>

</xml_diff>